<commit_message>
Docs for a public release: README rewritten, assembly guide brought up to date (v0.3 box, top-tab mounting, stay-awake, calibration, float test), generic HA package matching the pump shutoff in use
Co-Authored-By: Claude Opus 5.5 <noreply@anthropic.com>
</commit_message>
<xml_diff>
--- a/docs/DIP-assembly-guide.docx
+++ b/docs/DIP-assembly-guide.docx
@@ -126,7 +126,7 @@
         <w:spacing w:after="60"/>
       </w:pPr>
       <w:r>
-        <w:t>Every 20 minutes it wakes, sends its readings to Home Assistant over Wi-Fi, and goes back to sleep. Home Assistant graphs the level, sends a phone alert if it gets low, and turns the pond pumps off so they don't run dry.</w:t>
+        <w:t>Every 20 minutes it wakes, sends its readings to Home Assistant over Wi-Fi, and goes back to sleep. Home Assistant graphs the level, turns off one pump when the water drops 3", and turns off all the pumps with an urgent phone alert when the water drops below the float, so they don't run dry.</w:t>
       </w:r>
     </w:p>
     <w:p>
@@ -973,7 +973,7 @@
               <w:rPr>
                 <w:sz w:val="20"/>
               </w:rPr>
-              <w:t>JSN-SR20-Y3.0 ultrasonic sensor board + 2 probes</w:t>
+              <w:t>JSN-SR20 dual-probe ultrasonic sensor (sold as JSN-SR20-Y1) + 2 probes</w:t>
             </w:r>
           </w:p>
         </w:tc>
@@ -1501,6 +1501,50 @@
               <w:rPr>
                 <w:sz w:val="20"/>
               </w:rPr>
+              <w:t>Wood screws, stainless</w:t>
+            </w:r>
+          </w:p>
+        </w:tc>
+        <w:tc>
+          <w:tcPr>
+            <w:tcW w:type="dxa" w:w="1440"/>
+          </w:tcPr>
+          <w:p>
+            <w:r/>
+            <w:r>
+              <w:rPr>
+                <w:sz w:val="20"/>
+              </w:rPr>
+              <w:t>2</w:t>
+            </w:r>
+          </w:p>
+        </w:tc>
+        <w:tc>
+          <w:tcPr>
+            <w:tcW w:type="dxa" w:w="4320"/>
+          </w:tcPr>
+          <w:p>
+            <w:r/>
+            <w:r>
+              <w:rPr>
+                <w:sz w:val="20"/>
+              </w:rPr>
+              <w:t>Hang the box on the post through its top tab.</w:t>
+            </w:r>
+          </w:p>
+        </w:tc>
+      </w:tr>
+      <w:tr>
+        <w:tc>
+          <w:tcPr>
+            <w:tcW w:type="dxa" w:w="3744"/>
+          </w:tcPr>
+          <w:p>
+            <w:r/>
+            <w:r>
+              <w:rPr>
+                <w:sz w:val="20"/>
+              </w:rPr>
               <w:t>Short stainless screw</w:t>
             </w:r>
           </w:p>
@@ -2373,7 +2417,7 @@
               <w:rPr>
                 <w:sz w:val="20"/>
               </w:rPr>
-              <w:t>The electronics box that mounts on the post</w:t>
+              <w:t>The electronics box that hangs on the post</w:t>
             </w:r>
           </w:p>
         </w:tc>
@@ -2387,7 +2431,7 @@
               <w:rPr>
                 <w:sz w:val="20"/>
               </w:rPr>
-              <w:t>As it comes, back plate down</w:t>
+              <w:t>As it comes, back plate down, no supports</w:t>
             </w:r>
           </w:p>
         </w:tc>
@@ -3454,7 +3498,7 @@
         <w:rPr>
           <w:i w:val="0"/>
         </w:rPr>
-        <w:t>Screw a PG7 gland into each of the 3 holes in the bottom end of the box, with its nut inside. Leave the domed caps loose for now: cables go through later.</w:t>
+        <w:t>Screw a PG7 gland into each of the 3 holes in the bottom end of the box, with its lock nut inside. The nuts just fit side by side: turn each one by hand, then snug it with pliers. Leave the domed caps loose for now: cables go through later.</w:t>
       </w:r>
     </w:p>
     <w:p>
@@ -5427,7 +5471,7 @@
         <w:rPr>
           <w:i w:val="0"/>
         </w:rPr>
-        <w:t>After this first time, updates go over Wi-Fi: turn on "DIP stay awake" in Home Assistant so it doesn't fall asleep during the update.</w:t>
+        <w:t>After this first time, updates go over Wi-Fi. DIP sleeps most of the time, so first turn on "DIP stay awake" in Home Assistant and wait for its next wake (up to 20 minutes): it sees the switch and stays on. Turn the switch off when you're done. Left on, it drains the battery in a day or two.</w:t>
       </w:r>
     </w:p>
     <w:p>
@@ -5475,7 +5519,7 @@
         <w:tab/>
       </w:r>
       <w:r>
-        <w:t>Install the package (ha/dip_package.yaml) into Home Assistant's packages folder. Check the pump switch names at the top of the file match your pond pump plug.</w:t>
+        <w:t>Copy ha/dip_package.yaml into Home Assistant's packages folder. The steps at the top of the file show what to change: your two pump switches (the one that stops first, at 3" down, and the one that stops at the float) and your phone.</w:t>
       </w:r>
     </w:p>
     <w:p>
@@ -5495,7 +5539,7 @@
         <w:tab/>
       </w:r>
       <w:r>
-        <w:t>Restart Home Assistant.</w:t>
+        <w:t>Check the configuration (Developer tools &gt; YAML &gt; Check configuration), then restart Home Assistant.</w:t>
       </w:r>
     </w:p>
     <w:p>
@@ -5507,11 +5551,43 @@
       </w:r>
     </w:p>
     <w:p>
+      <w:pPr>
+        <w:tabs>
+          <w:tab w:pos="648" w:val="left"/>
+        </w:tabs>
+        <w:spacing w:after="80"/>
+        <w:ind w:left="648" w:hanging="648"/>
+      </w:pPr>
       <w:r>
         <w:rPr>
-          <w:i w:val="0"/>
+          <w:b/>
+          <w:color w:val="1F4E8C"/>
         </w:rPr>
-        <w:t>With the pond full, read "Distance to water" and type that number into "Pond full distance". From then on, the pond level shows as inches below full.</w:t>
+        <w:t>1.</w:t>
+        <w:tab/>
+      </w:r>
+      <w:r>
+        <w:t>Level: with the pond full, read DIP's "Distance to water" and type that number into "Pond full distance". From then on "Pond level below full" shows how many inches the water has dropped.</w:t>
+      </w:r>
+    </w:p>
+    <w:p>
+      <w:pPr>
+        <w:tabs>
+          <w:tab w:pos="648" w:val="left"/>
+        </w:tabs>
+        <w:spacing w:after="80"/>
+        <w:ind w:left="648" w:hanging="648"/>
+      </w:pPr>
+      <w:r>
+        <w:rPr>
+          <w:b/>
+          <w:color w:val="1F4E8C"/>
+        </w:rPr>
+        <w:t>2.</w:t>
+        <w:tab/>
+      </w:r>
+      <w:r>
+        <w:t>Battery: measure the cell with the multimeter and compare it with DIP's "Battery voltage". If they're more than about 0.03 V apart, multiply the multiply: number under the battery sensor in dip.yaml by (meter reading / DIP's reading) and load the firmware again. A full cell then shows 100 %.</w:t>
       </w:r>
     </w:p>
     <w:p>
@@ -5559,7 +5635,7 @@
         <w:tab/>
       </w:r>
       <w:r>
-        <w:t>Decide how low is "too low". Screw the float bracket inside the pipe at that height with the 2 M4 screws through the pipe wall (drill the pipe first).</w:t>
+        <w:t>Decide how low is "too low": below this the pumps all shut off. 6-8" below the full level suits most ponds. Screw the float bracket inside the pipe at that height with the 2 M4 screws through the pipe wall (drill the pipe first).</w:t>
       </w:r>
     </w:p>
     <w:p>
@@ -5639,7 +5715,7 @@
         <w:tab/>
       </w:r>
       <w:r>
-        <w:t>Mount the box on the post with the glands at the bottom. Run the cables along the back of the coping, under the net.</w:t>
+        <w:t>Hang the box on the post, glands at the bottom, with 2 stainless wood screws through the tab at the top. Run the cables along the back of the coping, under the net.</w:t>
       </w:r>
     </w:p>
     <w:tbl>
@@ -5716,7 +5792,7 @@
         <w:spacing w:after="60"/>
       </w:pPr>
       <w:r>
-        <w:t>Lift the float with a stick (or lower the water a little): "Float switch low" turns on within seconds and you get the alert. Let it go and it clears.</w:t>
+        <w:t>Push the float down with a stick and hold it for a minute: "Float switch low" turns on within seconds, the pumps turn off and you get the alert. Let it go: the float clears, and the pumps come back on by themselves (the last one after 10 minutes, the first one at its next reading).</w:t>
       </w:r>
     </w:p>
     <w:p>

</xml_diff>

<commit_message>
v0.4: XIAO ESP32-C6 and a plain 18650 holder
The battery shield's always-on 5V booster emptied a full cell in about a day.
The XIAO charges the cell itself and sleeps at microamps. New pins, battery
platform, XIAO mount and USB-C cable clip; guide, diagrams and PDF updated.

Co-Authored-By: Claude Opus 5.5 <noreply@anthropic.com>
</commit_message>
<xml_diff>
--- a/docs/DIP-assembly-guide.docx
+++ b/docs/DIP-assembly-guide.docx
@@ -204,7 +204,7 @@
         <w:spacing w:after="40"/>
       </w:pPr>
       <w:r>
-        <w:t>7. Wire the battery holder, SuperMini and sensor board</w:t>
+        <w:t>7. Wire the battery, XIAO and sensor board</w:t>
       </w:r>
     </w:p>
     <w:p>
@@ -301,7 +301,7 @@
       <w:r>
         <w:drawing>
           <wp:inline xmlns:a="http://schemas.openxmlformats.org/drawingml/2006/main" xmlns:pic="http://schemas.openxmlformats.org/drawingml/2006/picture">
-            <wp:extent cx="6126480" cy="4092321"/>
+            <wp:extent cx="6126480" cy="4534372"/>
             <wp:docPr id="2" name="Picture 2"/>
             <wp:cNvGraphicFramePr>
               <a:graphicFrameLocks noChangeAspect="1"/>
@@ -322,7 +322,7 @@
                   <pic:spPr>
                     <a:xfrm>
                       <a:off x="0" y="0"/>
-                      <a:ext cx="6126480" cy="4092321"/>
+                      <a:ext cx="6126480" cy="4534372"/>
                     </a:xfrm>
                     <a:prstGeom prst="rect"/>
                   </pic:spPr>
@@ -729,7 +729,7 @@
               <w:rPr>
                 <w:sz w:val="20"/>
               </w:rPr>
-              <w:t>Loading the software onto the SuperMini</w:t>
+              <w:t>Loading the software onto the XIAO</w:t>
             </w:r>
           </w:p>
         </w:tc>
@@ -885,7 +885,7 @@
               <w:rPr>
                 <w:sz w:val="20"/>
               </w:rPr>
-              <w:t>ESP32-C3 SuperMini board</w:t>
+              <w:t>Seeed XIAO ESP32-C6</w:t>
             </w:r>
           </w:p>
         </w:tc>
@@ -913,7 +913,7 @@
               <w:rPr>
                 <w:sz w:val="20"/>
               </w:rPr>
-              <w:t>The small black board with a USB-C socket. This is the brain.</w:t>
+              <w:t>The small board with a USB-C socket and a metal can. This is the brain, and it charges the battery.</w:t>
             </w:r>
           </w:p>
         </w:tc>
@@ -929,7 +929,7 @@
               <w:rPr>
                 <w:sz w:val="20"/>
               </w:rPr>
-              <w:t>18650 battery holder board + 18650 cell</w:t>
+              <w:t>Plain single-18650 holder with wire leads + 18650 cell</w:t>
             </w:r>
           </w:p>
         </w:tc>
@@ -957,7 +957,7 @@
               <w:rPr>
                 <w:sz w:val="20"/>
               </w:rPr>
-              <w:t>Charges through USB-C. Has three 3V and three 5V output pad pairs.</w:t>
+              <w:t>Just a cradle with a red and a black wire. Use a name-brand cell (Samsung, LG, Molicel).</w:t>
             </w:r>
           </w:p>
         </w:tc>
@@ -1295,7 +1295,7 @@
               <w:rPr>
                 <w:sz w:val="20"/>
               </w:rPr>
-              <w:t>7</w:t>
+              <w:t>8</w:t>
             </w:r>
           </w:p>
         </w:tc>
@@ -1309,7 +1309,7 @@
               <w:rPr>
                 <w:sz w:val="20"/>
               </w:rPr>
-              <w:t>4 for the box lid, 3 for the pipe cap top.</w:t>
+              <w:t>4 for the box lid, 1 for the battery platform, 3 for the pipe cap top.</w:t>
             </w:r>
           </w:p>
         </w:tc>
@@ -1397,7 +1397,7 @@
               <w:rPr>
                 <w:sz w:val="20"/>
               </w:rPr>
-              <w:t>4 for the sensor board, 1 for the SuperMini clamp.</w:t>
+              <w:t>4 for the sensor board, 1 for the XIAO clamp.</w:t>
             </w:r>
           </w:p>
         </w:tc>
@@ -1413,7 +1413,7 @@
               <w:rPr>
                 <w:sz w:val="20"/>
               </w:rPr>
-              <w:t>Screws for the battery holder</w:t>
+              <w:t>M3 x 8 screw + 1 more M3 heat-set insert</w:t>
             </w:r>
           </w:p>
         </w:tc>
@@ -1427,7 +1427,7 @@
               <w:rPr>
                 <w:sz w:val="20"/>
               </w:rPr>
-              <w:t>4</w:t>
+              <w:t>1 + 1</w:t>
             </w:r>
           </w:p>
         </w:tc>
@@ -1441,7 +1441,51 @@
               <w:rPr>
                 <w:sz w:val="20"/>
               </w:rPr>
-              <w:t>M3 x 6, or the ones that came with the holder.</w:t>
+              <w:t>Holds the battery holder through the hole in its floor.</w:t>
+            </w:r>
+          </w:p>
+        </w:tc>
+      </w:tr>
+      <w:tr>
+        <w:tc>
+          <w:tcPr>
+            <w:tcW w:type="dxa" w:w="3744"/>
+          </w:tcPr>
+          <w:p>
+            <w:r/>
+            <w:r>
+              <w:rPr>
+                <w:sz w:val="20"/>
+              </w:rPr>
+              <w:t>Short USB-C cable</w:t>
+            </w:r>
+          </w:p>
+        </w:tc>
+        <w:tc>
+          <w:tcPr>
+            <w:tcW w:type="dxa" w:w="1440"/>
+          </w:tcPr>
+          <w:p>
+            <w:r/>
+            <w:r>
+              <w:rPr>
+                <w:sz w:val="20"/>
+              </w:rPr>
+              <w:t>1</w:t>
+            </w:r>
+          </w:p>
+        </w:tc>
+        <w:tc>
+          <w:tcPr>
+            <w:tcW w:type="dxa" w:w="4320"/>
+          </w:tcPr>
+          <w:p>
+            <w:r/>
+            <w:r>
+              <w:rPr>
+                <w:sz w:val="20"/>
+              </w:rPr>
+              <w:t>Stays plugged into the XIAO, for charging with the lid off.</w:t>
             </w:r>
           </w:p>
         </w:tc>
@@ -1676,6 +1720,14 @@
         <w:t>What the electronic parts look like</w:t>
       </w:r>
     </w:p>
+    <w:p>
+      <w:r>
+        <w:rPr>
+          <w:i w:val="0"/>
+        </w:rPr>
+        <w:t>The XIAO's pin names (D0-D10, 5V, GND, 3V3) are printed on its back, and the two battery pads (BAT - and BAT +) are underneath too. Chapter 7 has a picture of the pins.</w:t>
+      </w:r>
+    </w:p>
     <w:tbl>
       <w:tblPr>
         <w:tblW w:type="auto" w:w="0"/>
@@ -1707,7 +1759,7 @@
                     <a:graphicData uri="http://schemas.openxmlformats.org/drawingml/2006/picture">
                       <pic:pic>
                         <pic:nvPicPr>
-                          <pic:cNvPr id="0" name="supermini_front.jpg"/>
+                          <pic:cNvPr id="0" name="sensor_front.jpg"/>
                           <pic:cNvPicPr/>
                         </pic:nvPicPr>
                         <pic:blipFill>
@@ -1751,7 +1803,7 @@
                     <a:graphicData uri="http://schemas.openxmlformats.org/drawingml/2006/picture">
                       <pic:pic>
                         <pic:nvPicPr>
-                          <pic:cNvPr id="0" name="supermini_back.jpg"/>
+                          <pic:cNvPr id="0" name="sensor_back.jpg"/>
                           <pic:cNvPicPr/>
                         </pic:nvPicPr>
                         <pic:blipFill>
@@ -1787,7 +1839,7 @@
           <w:color w:val="555555"/>
           <w:sz w:val="18"/>
         </w:rPr>
-        <w:t>ESP32-C3 SuperMini, front (left) and back (right). The pin numbers are printed on the BACK.</w:t>
+        <w:t>Ultrasonic sensor board, parts side (left) and connector side (right). Note the empty MODE pad top left: leave it empty.</w:t>
       </w:r>
     </w:p>
     <w:tbl>
@@ -1821,7 +1873,7 @@
                     <a:graphicData uri="http://schemas.openxmlformats.org/drawingml/2006/picture">
                       <pic:pic>
                         <pic:nvPicPr>
-                          <pic:cNvPr id="0" name="holder_top_b.jpg"/>
+                          <pic:cNvPr id="0" name="probes.jpg"/>
                           <pic:cNvPicPr/>
                         </pic:nvPicPr>
                         <pic:blipFill>
@@ -1865,7 +1917,7 @@
                     <a:graphicData uri="http://schemas.openxmlformats.org/drawingml/2006/picture">
                       <pic:pic>
                         <pic:nvPicPr>
-                          <pic:cNvPr id="0" name="holder_back.jpg"/>
+                          <pic:cNvPr id="0" name="temp_probe.jpg"/>
                           <pic:cNvPicPr/>
                         </pic:nvPicPr>
                         <pic:blipFill>
@@ -1901,7 +1953,7 @@
           <w:color w:val="555555"/>
           <w:sz w:val="18"/>
         </w:rPr>
-        <w:t>Battery holder, top and back. The pad pairs along the edges are marked 3V on one side and 5V on the other. The square pad of each pair is +.</w:t>
+        <w:t>The two ultrasonic probes on their cables (left) and the temperature probe (right).</w:t>
       </w:r>
     </w:p>
     <w:tbl>
@@ -1935,7 +1987,7 @@
                     <a:graphicData uri="http://schemas.openxmlformats.org/drawingml/2006/picture">
                       <pic:pic>
                         <pic:nvPicPr>
-                          <pic:cNvPr id="0" name="sensor_front.jpg"/>
+                          <pic:cNvPr id="0" name="float_switch.jpg"/>
                           <pic:cNvPicPr/>
                         </pic:nvPicPr>
                         <pic:blipFill>
@@ -1970,236 +2022,8 @@
             <w:r>
               <w:drawing>
                 <wp:inline xmlns:a="http://schemas.openxmlformats.org/drawingml/2006/main" xmlns:pic="http://schemas.openxmlformats.org/drawingml/2006/picture">
-                  <wp:extent cx="2834640" cy="2125980"/>
+                  <wp:extent cx="2834640" cy="3779520"/>
                   <wp:docPr id="8" name="Picture 8"/>
-                  <wp:cNvGraphicFramePr>
-                    <a:graphicFrameLocks noChangeAspect="1"/>
-                  </wp:cNvGraphicFramePr>
-                  <a:graphic>
-                    <a:graphicData uri="http://schemas.openxmlformats.org/drawingml/2006/picture">
-                      <pic:pic>
-                        <pic:nvPicPr>
-                          <pic:cNvPr id="0" name="sensor_back.jpg"/>
-                          <pic:cNvPicPr/>
-                        </pic:nvPicPr>
-                        <pic:blipFill>
-                          <a:blip r:embed="rId17"/>
-                          <a:stretch>
-                            <a:fillRect/>
-                          </a:stretch>
-                        </pic:blipFill>
-                        <pic:spPr>
-                          <a:xfrm>
-                            <a:off x="0" y="0"/>
-                            <a:ext cx="2834640" cy="2125980"/>
-                          </a:xfrm>
-                          <a:prstGeom prst="rect"/>
-                        </pic:spPr>
-                      </pic:pic>
-                    </a:graphicData>
-                  </a:graphic>
-                </wp:inline>
-              </w:drawing>
-            </w:r>
-          </w:p>
-        </w:tc>
-      </w:tr>
-    </w:tbl>
-    <w:p>
-      <w:pPr>
-        <w:jc w:val="center"/>
-      </w:pPr>
-      <w:r>
-        <w:rPr>
-          <w:i/>
-          <w:color w:val="555555"/>
-          <w:sz w:val="18"/>
-        </w:rPr>
-        <w:t>Ultrasonic sensor board, parts side (left) and connector side (right). Note the empty MODE pad top left: leave it empty.</w:t>
-      </w:r>
-    </w:p>
-    <w:tbl>
-      <w:tblPr>
-        <w:tblW w:type="auto" w:w="0"/>
-        <w:jc w:val="center"/>
-        <w:tblLook w:firstColumn="1" w:firstRow="1" w:lastColumn="0" w:lastRow="0" w:noHBand="0" w:noVBand="1" w:val="04A0"/>
-      </w:tblPr>
-      <w:tblGrid>
-        <w:gridCol w:w="4824"/>
-        <w:gridCol w:w="4824"/>
-      </w:tblGrid>
-      <w:tr>
-        <w:tc>
-          <w:tcPr>
-            <w:tcW w:type="dxa" w:w="4824"/>
-          </w:tcPr>
-          <w:p>
-            <w:pPr>
-              <w:jc w:val="center"/>
-            </w:pPr>
-            <w:r>
-              <w:drawing>
-                <wp:inline xmlns:a="http://schemas.openxmlformats.org/drawingml/2006/main" xmlns:pic="http://schemas.openxmlformats.org/drawingml/2006/picture">
-                  <wp:extent cx="2834640" cy="2125980"/>
-                  <wp:docPr id="9" name="Picture 9"/>
-                  <wp:cNvGraphicFramePr>
-                    <a:graphicFrameLocks noChangeAspect="1"/>
-                  </wp:cNvGraphicFramePr>
-                  <a:graphic>
-                    <a:graphicData uri="http://schemas.openxmlformats.org/drawingml/2006/picture">
-                      <pic:pic>
-                        <pic:nvPicPr>
-                          <pic:cNvPr id="0" name="probes.jpg"/>
-                          <pic:cNvPicPr/>
-                        </pic:nvPicPr>
-                        <pic:blipFill>
-                          <a:blip r:embed="rId18"/>
-                          <a:stretch>
-                            <a:fillRect/>
-                          </a:stretch>
-                        </pic:blipFill>
-                        <pic:spPr>
-                          <a:xfrm>
-                            <a:off x="0" y="0"/>
-                            <a:ext cx="2834640" cy="2125980"/>
-                          </a:xfrm>
-                          <a:prstGeom prst="rect"/>
-                        </pic:spPr>
-                      </pic:pic>
-                    </a:graphicData>
-                  </a:graphic>
-                </wp:inline>
-              </w:drawing>
-            </w:r>
-          </w:p>
-        </w:tc>
-        <w:tc>
-          <w:tcPr>
-            <w:tcW w:type="dxa" w:w="4824"/>
-          </w:tcPr>
-          <w:p>
-            <w:pPr>
-              <w:jc w:val="center"/>
-            </w:pPr>
-            <w:r>
-              <w:drawing>
-                <wp:inline xmlns:a="http://schemas.openxmlformats.org/drawingml/2006/main" xmlns:pic="http://schemas.openxmlformats.org/drawingml/2006/picture">
-                  <wp:extent cx="2834640" cy="2125980"/>
-                  <wp:docPr id="10" name="Picture 10"/>
-                  <wp:cNvGraphicFramePr>
-                    <a:graphicFrameLocks noChangeAspect="1"/>
-                  </wp:cNvGraphicFramePr>
-                  <a:graphic>
-                    <a:graphicData uri="http://schemas.openxmlformats.org/drawingml/2006/picture">
-                      <pic:pic>
-                        <pic:nvPicPr>
-                          <pic:cNvPr id="0" name="temp_probe.jpg"/>
-                          <pic:cNvPicPr/>
-                        </pic:nvPicPr>
-                        <pic:blipFill>
-                          <a:blip r:embed="rId19"/>
-                          <a:stretch>
-                            <a:fillRect/>
-                          </a:stretch>
-                        </pic:blipFill>
-                        <pic:spPr>
-                          <a:xfrm>
-                            <a:off x="0" y="0"/>
-                            <a:ext cx="2834640" cy="2125980"/>
-                          </a:xfrm>
-                          <a:prstGeom prst="rect"/>
-                        </pic:spPr>
-                      </pic:pic>
-                    </a:graphicData>
-                  </a:graphic>
-                </wp:inline>
-              </w:drawing>
-            </w:r>
-          </w:p>
-        </w:tc>
-      </w:tr>
-    </w:tbl>
-    <w:p>
-      <w:pPr>
-        <w:jc w:val="center"/>
-      </w:pPr>
-      <w:r>
-        <w:rPr>
-          <w:i/>
-          <w:color w:val="555555"/>
-          <w:sz w:val="18"/>
-        </w:rPr>
-        <w:t>The two ultrasonic probes on their cables (left) and the temperature probe (right).</w:t>
-      </w:r>
-    </w:p>
-    <w:tbl>
-      <w:tblPr>
-        <w:tblW w:type="auto" w:w="0"/>
-        <w:jc w:val="center"/>
-        <w:tblLook w:firstColumn="1" w:firstRow="1" w:lastColumn="0" w:lastRow="0" w:noHBand="0" w:noVBand="1" w:val="04A0"/>
-      </w:tblPr>
-      <w:tblGrid>
-        <w:gridCol w:w="4824"/>
-        <w:gridCol w:w="4824"/>
-      </w:tblGrid>
-      <w:tr>
-        <w:tc>
-          <w:tcPr>
-            <w:tcW w:type="dxa" w:w="4824"/>
-          </w:tcPr>
-          <w:p>
-            <w:pPr>
-              <w:jc w:val="center"/>
-            </w:pPr>
-            <w:r>
-              <w:drawing>
-                <wp:inline xmlns:a="http://schemas.openxmlformats.org/drawingml/2006/main" xmlns:pic="http://schemas.openxmlformats.org/drawingml/2006/picture">
-                  <wp:extent cx="2834640" cy="2125980"/>
-                  <wp:docPr id="11" name="Picture 11"/>
-                  <wp:cNvGraphicFramePr>
-                    <a:graphicFrameLocks noChangeAspect="1"/>
-                  </wp:cNvGraphicFramePr>
-                  <a:graphic>
-                    <a:graphicData uri="http://schemas.openxmlformats.org/drawingml/2006/picture">
-                      <pic:pic>
-                        <pic:nvPicPr>
-                          <pic:cNvPr id="0" name="float_switch.jpg"/>
-                          <pic:cNvPicPr/>
-                        </pic:nvPicPr>
-                        <pic:blipFill>
-                          <a:blip r:embed="rId20"/>
-                          <a:stretch>
-                            <a:fillRect/>
-                          </a:stretch>
-                        </pic:blipFill>
-                        <pic:spPr>
-                          <a:xfrm>
-                            <a:off x="0" y="0"/>
-                            <a:ext cx="2834640" cy="2125980"/>
-                          </a:xfrm>
-                          <a:prstGeom prst="rect"/>
-                        </pic:spPr>
-                      </pic:pic>
-                    </a:graphicData>
-                  </a:graphic>
-                </wp:inline>
-              </w:drawing>
-            </w:r>
-          </w:p>
-        </w:tc>
-        <w:tc>
-          <w:tcPr>
-            <w:tcW w:type="dxa" w:w="4824"/>
-          </w:tcPr>
-          <w:p>
-            <w:pPr>
-              <w:jc w:val="center"/>
-            </w:pPr>
-            <w:r>
-              <w:drawing>
-                <wp:inline xmlns:a="http://schemas.openxmlformats.org/drawingml/2006/main" xmlns:pic="http://schemas.openxmlformats.org/drawingml/2006/picture">
-                  <wp:extent cx="2834640" cy="3779520"/>
-                  <wp:docPr id="12" name="Picture 12"/>
                   <wp:cNvGraphicFramePr>
                     <a:graphicFrameLocks noChangeAspect="1"/>
                   </wp:cNvGraphicFramePr>
@@ -2211,7 +2035,7 @@
                           <pic:cNvPicPr/>
                         </pic:nvPicPr>
                         <pic:blipFill>
-                          <a:blip r:embed="rId21"/>
+                          <a:blip r:embed="rId17"/>
                           <a:stretch>
                             <a:fillRect/>
                           </a:stretch>
@@ -2270,7 +2094,7 @@
         <w:drawing>
           <wp:inline xmlns:a="http://schemas.openxmlformats.org/drawingml/2006/main" xmlns:pic="http://schemas.openxmlformats.org/drawingml/2006/picture">
             <wp:extent cx="5669280" cy="3014048"/>
-            <wp:docPr id="13" name="Picture 13"/>
+            <wp:docPr id="9" name="Picture 9"/>
             <wp:cNvGraphicFramePr>
               <a:graphicFrameLocks noChangeAspect="1"/>
             </wp:cNvGraphicFramePr>
@@ -2282,7 +2106,7 @@
                     <pic:cNvPicPr/>
                   </pic:nvPicPr>
                   <pic:blipFill>
-                    <a:blip r:embed="rId22"/>
+                    <a:blip r:embed="rId18"/>
                     <a:stretch>
                       <a:fillRect/>
                     </a:stretch>
@@ -2505,7 +2329,7 @@
               <w:rPr>
                 <w:sz w:val="20"/>
               </w:rPr>
-              <w:t>Small tab that holds the SuperMini down</w:t>
+              <w:t>Small tab that holds the XIAO down</w:t>
             </w:r>
           </w:p>
         </w:tc>
@@ -2710,7 +2534,7 @@
         <w:drawing>
           <wp:inline xmlns:a="http://schemas.openxmlformats.org/drawingml/2006/main" xmlns:pic="http://schemas.openxmlformats.org/drawingml/2006/picture">
             <wp:extent cx="5852160" cy="2660073"/>
-            <wp:docPr id="14" name="Picture 14"/>
+            <wp:docPr id="10" name="Picture 10"/>
             <wp:cNvGraphicFramePr>
               <a:graphicFrameLocks noChangeAspect="1"/>
             </wp:cNvGraphicFramePr>
@@ -2722,7 +2546,7 @@
                     <pic:cNvPicPr/>
                   </pic:nvPicPr>
                   <pic:blipFill>
-                    <a:blip r:embed="rId23"/>
+                    <a:blip r:embed="rId19"/>
                     <a:stretch>
                       <a:fillRect/>
                     </a:stretch>
@@ -2762,7 +2586,7 @@
         <w:drawing>
           <wp:inline xmlns:a="http://schemas.openxmlformats.org/drawingml/2006/main" xmlns:pic="http://schemas.openxmlformats.org/drawingml/2006/picture">
             <wp:extent cx="5852160" cy="2442430"/>
-            <wp:docPr id="15" name="Picture 15"/>
+            <wp:docPr id="11" name="Picture 11"/>
             <wp:cNvGraphicFramePr>
               <a:graphicFrameLocks noChangeAspect="1"/>
             </wp:cNvGraphicFramePr>
@@ -2774,7 +2598,7 @@
                     <pic:cNvPicPr/>
                   </pic:nvPicPr>
                   <pic:blipFill>
-                    <a:blip r:embed="rId24"/>
+                    <a:blip r:embed="rId20"/>
                     <a:stretch>
                       <a:fillRect/>
                     </a:stretch>
@@ -2814,7 +2638,7 @@
         <w:drawing>
           <wp:inline xmlns:a="http://schemas.openxmlformats.org/drawingml/2006/main" xmlns:pic="http://schemas.openxmlformats.org/drawingml/2006/picture">
             <wp:extent cx="5852160" cy="2660073"/>
-            <wp:docPr id="16" name="Picture 16"/>
+            <wp:docPr id="12" name="Picture 12"/>
             <wp:cNvGraphicFramePr>
               <a:graphicFrameLocks noChangeAspect="1"/>
             </wp:cNvGraphicFramePr>
@@ -2826,7 +2650,7 @@
                     <pic:cNvPicPr/>
                   </pic:nvPicPr>
                   <pic:blipFill>
-                    <a:blip r:embed="rId25"/>
+                    <a:blip r:embed="rId21"/>
                     <a:stretch>
                       <a:fillRect/>
                     </a:stretch>
@@ -2881,7 +2705,7 @@
               <w:drawing>
                 <wp:inline xmlns:a="http://schemas.openxmlformats.org/drawingml/2006/main" xmlns:pic="http://schemas.openxmlformats.org/drawingml/2006/picture">
                   <wp:extent cx="2743200" cy="2194560"/>
-                  <wp:docPr id="17" name="Picture 17"/>
+                  <wp:docPr id="13" name="Picture 13"/>
                   <wp:cNvGraphicFramePr>
                     <a:graphicFrameLocks noChangeAspect="1"/>
                   </wp:cNvGraphicFramePr>
@@ -2893,7 +2717,7 @@
                           <pic:cNvPicPr/>
                         </pic:nvPicPr>
                         <pic:blipFill>
-                          <a:blip r:embed="rId26"/>
+                          <a:blip r:embed="rId22"/>
                           <a:stretch>
                             <a:fillRect/>
                           </a:stretch>
@@ -2925,7 +2749,7 @@
               <w:drawing>
                 <wp:inline xmlns:a="http://schemas.openxmlformats.org/drawingml/2006/main" xmlns:pic="http://schemas.openxmlformats.org/drawingml/2006/picture">
                   <wp:extent cx="2743200" cy="2194560"/>
-                  <wp:docPr id="18" name="Picture 18"/>
+                  <wp:docPr id="14" name="Picture 14"/>
                   <wp:cNvGraphicFramePr>
                     <a:graphicFrameLocks noChangeAspect="1"/>
                   </wp:cNvGraphicFramePr>
@@ -2937,7 +2761,7 @@
                           <pic:cNvPicPr/>
                         </pic:nvPicPr>
                         <pic:blipFill>
-                          <a:blip r:embed="rId27"/>
+                          <a:blip r:embed="rId23"/>
                           <a:stretch>
                             <a:fillRect/>
                           </a:stretch>
@@ -2995,7 +2819,7 @@
               <w:drawing>
                 <wp:inline xmlns:a="http://schemas.openxmlformats.org/drawingml/2006/main" xmlns:pic="http://schemas.openxmlformats.org/drawingml/2006/picture">
                   <wp:extent cx="2743200" cy="2194560"/>
-                  <wp:docPr id="19" name="Picture 19"/>
+                  <wp:docPr id="15" name="Picture 15"/>
                   <wp:cNvGraphicFramePr>
                     <a:graphicFrameLocks noChangeAspect="1"/>
                   </wp:cNvGraphicFramePr>
@@ -3007,7 +2831,7 @@
                           <pic:cNvPicPr/>
                         </pic:nvPicPr>
                         <pic:blipFill>
-                          <a:blip r:embed="rId28"/>
+                          <a:blip r:embed="rId24"/>
                           <a:stretch>
                             <a:fillRect/>
                           </a:stretch>
@@ -3039,7 +2863,7 @@
               <w:drawing>
                 <wp:inline xmlns:a="http://schemas.openxmlformats.org/drawingml/2006/main" xmlns:pic="http://schemas.openxmlformats.org/drawingml/2006/picture">
                   <wp:extent cx="2743200" cy="2194560"/>
-                  <wp:docPr id="20" name="Picture 20"/>
+                  <wp:docPr id="16" name="Picture 16"/>
                   <wp:cNvGraphicFramePr>
                     <a:graphicFrameLocks noChangeAspect="1"/>
                   </wp:cNvGraphicFramePr>
@@ -3051,7 +2875,7 @@
                           <pic:cNvPicPr/>
                         </pic:nvPicPr>
                         <pic:blipFill>
-                          <a:blip r:embed="rId29"/>
+                          <a:blip r:embed="rId25"/>
                           <a:stretch>
                             <a:fillRect/>
                           </a:stretch>
@@ -3083,7 +2907,7 @@
           <w:color w:val="555555"/>
           <w:sz w:val="18"/>
         </w:rPr>
-        <w:t>SuperMini clamp tab (left) and gasket (right)</w:t>
+        <w:t>XIAO clamp tab (left) and gasket (right)</w:t>
       </w:r>
     </w:p>
     <w:p>
@@ -3261,7 +3085,7 @@
         <w:drawing>
           <wp:inline xmlns:a="http://schemas.openxmlformats.org/drawingml/2006/main" xmlns:pic="http://schemas.openxmlformats.org/drawingml/2006/picture">
             <wp:extent cx="5669280" cy="3122908"/>
-            <wp:docPr id="21" name="Picture 21"/>
+            <wp:docPr id="17" name="Picture 17"/>
             <wp:cNvGraphicFramePr>
               <a:graphicFrameLocks noChangeAspect="1"/>
             </wp:cNvGraphicFramePr>
@@ -3273,7 +3097,7 @@
                     <pic:cNvPicPr/>
                   </pic:nvPicPr>
                   <pic:blipFill>
-                    <a:blip r:embed="rId30"/>
+                    <a:blip r:embed="rId26"/>
                     <a:stretch>
                       <a:fillRect/>
                     </a:stretch>
@@ -3331,7 +3155,7 @@
         <w:pStyle w:val="Heading2"/>
       </w:pPr>
       <w:r>
-        <w:t>Soldering into the SuperMini</w:t>
+        <w:t>Soldering into the XIAO</w:t>
       </w:r>
     </w:p>
     <w:p>
@@ -3339,7 +3163,7 @@
         <w:rPr>
           <w:i w:val="0"/>
         </w:rPr>
-        <w:t>The SuperMini's pins are half-holes along its edges. Push the tinned wire into the hole from the front, hold the iron against the gold pad and the wire, and feed in a little solder. Some holes take two wires (or a wire and a resistor leg): put both in, then solder them together.</w:t>
+        <w:t>The XIAO's pins are half-holes along its edges. Push the tinned wire into the hole from the front, hold the iron against the gold pad and the wire, and feed in a little solder. Some holes take two wires (or a wire and a resistor leg): put both in, then solder them together.</w:t>
       </w:r>
     </w:p>
     <w:tbl>
@@ -3422,7 +3246,7 @@
         <w:tab/>
       </w:r>
       <w:r>
-        <w:t>Find the 4 holes in the corner posts of the box and the 3 holes in the pipe cap's posts.</w:t>
+        <w:t>Find the 4 holes in the corner posts of the box, the 1 in the battery platform, and the 3 in the pipe cap's posts.</w:t>
       </w:r>
     </w:p>
     <w:p>
@@ -3509,7 +3333,7 @@
         <w:drawing>
           <wp:inline xmlns:a="http://schemas.openxmlformats.org/drawingml/2006/main" xmlns:pic="http://schemas.openxmlformats.org/drawingml/2006/picture">
             <wp:extent cx="5852160" cy="3121152"/>
-            <wp:docPr id="22" name="Picture 22"/>
+            <wp:docPr id="18" name="Picture 18"/>
             <wp:cNvGraphicFramePr>
               <a:graphicFrameLocks noChangeAspect="1"/>
             </wp:cNvGraphicFramePr>
@@ -3521,7 +3345,7 @@
                     <pic:cNvPicPr/>
                   </pic:nvPicPr>
                   <pic:blipFill>
-                    <a:blip r:embed="rId31"/>
+                    <a:blip r:embed="rId27"/>
                     <a:stretch>
                       <a:fillRect/>
                     </a:stretch>
@@ -3550,7 +3374,7 @@
           <w:color w:val="555555"/>
           <w:sz w:val="18"/>
         </w:rPr>
-        <w:t>How it all goes together inside the box (battery holder, sensor board and SuperMini), and the 3 gland holes in the bottom end</w:t>
+        <w:t>How it all goes together inside the box (battery holder, sensor board and XIAO), and the 3 gland holes in the bottom end</w:t>
       </w:r>
     </w:p>
     <w:p>
@@ -3695,7 +3519,7 @@
         <w:pStyle w:val="Heading1"/>
       </w:pPr>
       <w:r>
-        <w:t>7. Wire the battery holder, SuperMini and sensor board</w:t>
+        <w:t>7. Wire the battery, XIAO and sensor board</w:t>
       </w:r>
     </w:p>
     <w:tbl>
@@ -3737,7 +3561,7 @@
         <w:rPr>
           <w:i w:val="0"/>
         </w:rPr>
-        <w:t>First, find your way around the SuperMini. Turn it over so you can read the numbers on the back:</w:t>
+        <w:t>First, find your way around the XIAO. Here it is from the front (metal can up, USB-C at the top):</w:t>
       </w:r>
     </w:p>
     <w:p>
@@ -3747,8 +3571,8 @@
       <w:r>
         <w:drawing>
           <wp:inline xmlns:a="http://schemas.openxmlformats.org/drawingml/2006/main" xmlns:pic="http://schemas.openxmlformats.org/drawingml/2006/picture">
-            <wp:extent cx="5303520" cy="3235819"/>
-            <wp:docPr id="23" name="Picture 23"/>
+            <wp:extent cx="5303520" cy="3755121"/>
+            <wp:docPr id="19" name="Picture 19"/>
             <wp:cNvGraphicFramePr>
               <a:graphicFrameLocks noChangeAspect="1"/>
             </wp:cNvGraphicFramePr>
@@ -3760,7 +3584,7 @@
                     <pic:cNvPicPr/>
                   </pic:nvPicPr>
                   <pic:blipFill>
-                    <a:blip r:embed="rId32"/>
+                    <a:blip r:embed="rId28"/>
                     <a:stretch>
                       <a:fillRect/>
                     </a:stretch>
@@ -3768,7 +3592,7 @@
                   <pic:spPr>
                     <a:xfrm>
                       <a:off x="0" y="0"/>
-                      <a:ext cx="5303520" cy="3235819"/>
+                      <a:ext cx="5303520" cy="3755121"/>
                     </a:xfrm>
                     <a:prstGeom prst="rect"/>
                   </pic:spPr>
@@ -3784,7 +3608,7 @@
         <w:rPr>
           <w:i w:val="0"/>
         </w:rPr>
-        <w:t>You'll use 7 pins: 3.3, G, 3, 4 on one edge, and 5, 6, 7 on the other. The rest stay empty.</w:t>
+        <w:t>You'll use D0, D1, D3, D4 and D5 down one edge, GND and 3V3 on the other, and the two BAT pads underneath. The rest stay empty.</w:t>
       </w:r>
     </w:p>
     <w:p>
@@ -3800,7 +3624,7 @@
         <w:rPr>
           <w:i w:val="0"/>
         </w:rPr>
-        <w:t>These two 100k resistors let the SuperMini measure how full the battery is.</w:t>
+        <w:t>These two 100k resistors let the XIAO measure how full the battery is. They go on its underside, next to the battery pads.</w:t>
       </w:r>
     </w:p>
     <w:p>
@@ -3810,8 +3634,8 @@
       <w:r>
         <w:drawing>
           <wp:inline xmlns:a="http://schemas.openxmlformats.org/drawingml/2006/main" xmlns:pic="http://schemas.openxmlformats.org/drawingml/2006/picture">
-            <wp:extent cx="5486400" cy="3050109"/>
-            <wp:docPr id="24" name="Picture 24"/>
+            <wp:extent cx="5486400" cy="3537367"/>
+            <wp:docPr id="20" name="Picture 20"/>
             <wp:cNvGraphicFramePr>
               <a:graphicFrameLocks noChangeAspect="1"/>
             </wp:cNvGraphicFramePr>
@@ -3823,7 +3647,7 @@
                     <pic:cNvPicPr/>
                   </pic:nvPicPr>
                   <pic:blipFill>
-                    <a:blip r:embed="rId33"/>
+                    <a:blip r:embed="rId29"/>
                     <a:stretch>
                       <a:fillRect/>
                     </a:stretch>
@@ -3831,7 +3655,7 @@
                   <pic:spPr>
                     <a:xfrm>
                       <a:off x="0" y="0"/>
-                      <a:ext cx="5486400" cy="3050109"/>
+                      <a:ext cx="5486400" cy="3537367"/>
                     </a:xfrm>
                     <a:prstGeom prst="rect"/>
                   </pic:spPr>
@@ -3859,7 +3683,7 @@
         <w:tab/>
       </w:r>
       <w:r>
-        <w:t>Slide a short piece of heat shrink over each leg of resistor (B). Bend the legs down so it bridges from hole G to hole 4, passing over hole 3.3 without touching it.</w:t>
+        <w:t>Slide heat shrink over the legs of both resistors. Lay them flat against the XIAO's back as in the picture.</w:t>
       </w:r>
     </w:p>
     <w:p>
@@ -3879,7 +3703,7 @@
         <w:tab/>
       </w:r>
       <w:r>
-        <w:t>Push the legs into G and 4 from the front side. Don't solder yet.</w:t>
+        <w:t>Resistor (A): one leg to the BAT + pad, the other into hole D0. Resistor (B): one leg into hole D0 too, the other to the BAT - pad.</w:t>
       </w:r>
     </w:p>
     <w:p>
@@ -3899,35 +3723,15 @@
         <w:tab/>
       </w:r>
       <w:r>
-        <w:t>Bend one leg of resistor (A) and push it into hole 4 next to (B)'s leg. Solder hole 4 (both legs) and hole G. Trim the extra leg length on the back with the cutters.</w:t>
+        <w:t>Solder D0 (both legs) from the back. Leave the BAT pads for the next step, so the battery wires and the resistor legs are soldered together.</w:t>
       </w:r>
     </w:p>
     <w:p>
       <w:pPr>
-        <w:tabs>
-          <w:tab w:pos="648" w:val="left"/>
-        </w:tabs>
-        <w:spacing w:after="80"/>
-        <w:ind w:left="648" w:hanging="648"/>
+        <w:pStyle w:val="Heading2"/>
       </w:pPr>
       <w:r>
-        <w:rPr>
-          <w:b/>
-          <w:color w:val="1F4E8C"/>
-        </w:rPr>
-        <w:t>4.</w:t>
-        <w:tab/>
-      </w:r>
-      <w:r>
-        <w:t>Solder a 10 cm wire (a purple or other spare color) onto the free leg of resistor (A), with heat shrink over the joint. This wire will go to the battery's + contact.</w:t>
-      </w:r>
-    </w:p>
-    <w:p>
-      <w:pPr>
-        <w:pStyle w:val="Heading2"/>
-      </w:pPr>
-      <w:r>
-        <w:t>7b. Power from the battery holder to the SuperMini</w:t>
+        <w:t>7b. The battery to the XIAO</w:t>
       </w:r>
     </w:p>
     <w:p>
@@ -3947,7 +3751,7 @@
         <w:tab/>
       </w:r>
       <w:r>
-        <w:t>Cut a red and a black wire, about 10 cm each. Strip and tin both ends.</w:t>
+        <w:t>Shorten the holder's red and black wires so they reach the XIAO's spot in the box with a little slack. Strip and tin the ends.</w:t>
       </w:r>
     </w:p>
     <w:p>
@@ -3967,48 +3771,42 @@
         <w:tab/>
       </w:r>
       <w:r>
-        <w:t>Solder the red wire into hole 3.3 and the black wire into hole G (G already has a resistor leg: the wire goes in alongside it).</w:t>
+        <w:t>Red to the BAT + pad, black to the BAT - pad, each together with the resistor leg already there.</w:t>
       </w:r>
     </w:p>
+    <w:tbl>
+      <w:tblPr>
+        <w:tblW w:type="auto" w:w="0"/>
+        <w:jc w:val="center"/>
+        <w:tblLook w:firstColumn="1" w:firstRow="1" w:lastColumn="0" w:lastRow="0" w:noHBand="0" w:noVBand="1" w:val="04A0"/>
+      </w:tblPr>
+      <w:tblGrid>
+        <w:gridCol w:w="9648"/>
+      </w:tblGrid>
+      <w:tr>
+        <w:tc>
+          <w:tcPr>
+            <w:tcW w:type="dxa" w:w="9504"/>
+            <w:shd w:val="clear" w:color="auto" w:fill="FDE2E1"/>
+          </w:tcPr>
+          <w:p>
+            <w:r>
+              <w:rPr>
+                <w:b/>
+              </w:rPr>
+              <w:t xml:space="preserve">Careful: </w:t>
+            </w:r>
+            <w:r>
+              <w:t>Get these the right way round: red to +, black to -. The wrong way round ruins the XIAO's charger. Check the + and - marks next to the pads.</w:t>
+            </w:r>
+          </w:p>
+        </w:tc>
+      </w:tr>
+    </w:tbl>
     <w:p>
       <w:pPr>
-        <w:tabs>
-          <w:tab w:pos="648" w:val="left"/>
-        </w:tabs>
-        <w:spacing w:after="80"/>
-        <w:ind w:left="648" w:hanging="648"/>
-      </w:pPr>
-      <w:r>
-        <w:rPr>
-          <w:b/>
-          <w:color w:val="1F4E8C"/>
-        </w:rPr>
-        <w:t>3.</w:t>
-        <w:tab/>
-      </w:r>
-      <w:r>
-        <w:t>Solder the other ends to the holder's 3V pair 1: red to the square + pad, black to the round - pad.</w:t>
-      </w:r>
-    </w:p>
-    <w:p>
-      <w:pPr>
-        <w:tabs>
-          <w:tab w:pos="648" w:val="left"/>
-        </w:tabs>
-        <w:spacing w:after="80"/>
-        <w:ind w:left="648" w:hanging="648"/>
-      </w:pPr>
-      <w:r>
-        <w:rPr>
-          <w:b/>
-          <w:color w:val="1F4E8C"/>
-        </w:rPr>
-        <w:t>4.</w:t>
-        <w:tab/>
-      </w:r>
-      <w:r>
-        <w:t>Solder the purple wire from resistor (A) to the holder's + battery contact. This is the metal clip at the end of the battery bay marked +; solder to where its tab comes through the back of the board.</w:t>
-      </w:r>
+        <w:spacing w:after="0"/>
+      </w:pPr>
     </w:p>
     <w:tbl>
       <w:tblPr>
@@ -4033,7 +3831,7 @@
               <w:t xml:space="preserve">Tip: </w:t>
             </w:r>
             <w:r>
-              <w:t>Check the + battery contact before you solder: put the battery in, set the meter to DC volts, and touch black to a 3V - pad and red to the contact. It should read between 3.0 and 4.2 V. Take the battery back out before soldering.</w:t>
+              <w:t>The XIAO charges the cell whenever its USB-C is plugged in. There's no switch: DIP is on whenever the cell is in.</w:t>
             </w:r>
           </w:p>
         </w:tc>
@@ -4117,7 +3915,7 @@
         <w:tab/>
       </w:r>
       <w:r>
-        <w:t>Trig wire into SuperMini hole 6, Echo wire into hole 7. Solder.</w:t>
+        <w:t>Trig wire into XIAO hole D4, Echo wire into hole D5. Solder.</w:t>
       </w:r>
     </w:p>
     <w:p>
@@ -4137,7 +3935,7 @@
         <w:tab/>
       </w:r>
       <w:r>
-        <w:t>5V wire to the holder's 3V pair 2 + (square pad). GND wire to 3V pair 2 - (round pad). Solder.</w:t>
+        <w:t>5V wire into hole 3V3, GND wire into hole GND. Don't solder yet: the 4-core cable's wires 1 and 2 join them in chapter 10.</w:t>
       </w:r>
     </w:p>
     <w:tbl>
@@ -4163,7 +3961,7 @@
               <w:t xml:space="preserve">Why 3V? </w:t>
             </w:r>
             <w:r>
-              <w:t>Yes, the sensor's "5V" pin goes to a 3V pad. This sensor normally works on 3.3V, and running it on 3.3V keeps its signals safe for the SuperMini. The bench test in chapter 8 confirms it on your board.</w:t>
+              <w:t>Yes, the sensor's "5V" pin goes to 3V3. This sensor normally works on 3.3V, and running it on 3.3V keeps its signals safe for the XIAO. The bench test in chapter 8 confirms it on your board.</w:t>
             </w:r>
           </w:p>
         </w:tc>
@@ -4226,7 +4024,7 @@
         <w:rPr>
           <w:i w:val="0"/>
         </w:rPr>
-        <w:t>Now test what you've built before anything goes outside. The software has to be loaded first: chapter 12 explains how, but if someone else is handling the software, give them the SuperMini at this point (still wired up).</w:t>
+        <w:t>Now test what you've built before anything goes outside. The software has to be loaded first: chapter 12 explains how, but if someone else is handling the software, give them the XIAO at this point (still wired up).</w:t>
       </w:r>
     </w:p>
     <w:p>
@@ -4266,7 +4064,7 @@
         <w:tab/>
       </w:r>
       <w:r>
-        <w:t>Put the battery in. Slide the holder's switch to the "stay on" position.</w:t>
+        <w:t>Solder the 3V3 and GND holes for now (you can add the cable wires later with a little more solder), then put the battery in.</w:t>
       </w:r>
     </w:p>
     <w:p>
@@ -4348,7 +4146,7 @@
         <w:rPr>
           <w:i/>
         </w:rPr>
-        <w:t>If the distance stays empty or reads nonsense at 3.3V, stop here and ask for help. Don't move the sensor to a 5V pad on your own: at 5V its Echo signal is too strong for the SuperMini and would need two extra resistors.</w:t>
+        <w:t>If the distance stays empty or reads nonsense at 3.3V, stop here and ask for help. Don't move the sensor to the 5V pin on your own: at 5V its Echo signal is too strong for the XIAO and would need two extra resistors.</w:t>
       </w:r>
     </w:p>
     <w:p>
@@ -4380,7 +4178,7 @@
         <w:drawing>
           <wp:inline xmlns:a="http://schemas.openxmlformats.org/drawingml/2006/main" xmlns:pic="http://schemas.openxmlformats.org/drawingml/2006/picture">
             <wp:extent cx="3291840" cy="2468880"/>
-            <wp:docPr id="25" name="Picture 25"/>
+            <wp:docPr id="21" name="Picture 21"/>
             <wp:cNvGraphicFramePr>
               <a:graphicFrameLocks noChangeAspect="1"/>
             </wp:cNvGraphicFramePr>
@@ -4392,7 +4190,7 @@
                     <pic:cNvPicPr/>
                   </pic:nvPicPr>
                   <pic:blipFill>
-                    <a:blip r:embed="rId34"/>
+                    <a:blip r:embed="rId30"/>
                     <a:stretch>
                       <a:fillRect/>
                     </a:stretch>
@@ -4572,7 +4370,7 @@
         <w:drawing>
           <wp:inline xmlns:a="http://schemas.openxmlformats.org/drawingml/2006/main" xmlns:pic="http://schemas.openxmlformats.org/drawingml/2006/picture">
             <wp:extent cx="5669280" cy="2984780"/>
-            <wp:docPr id="26" name="Picture 26"/>
+            <wp:docPr id="22" name="Picture 22"/>
             <wp:cNvGraphicFramePr>
               <a:graphicFrameLocks noChangeAspect="1"/>
             </wp:cNvGraphicFramePr>
@@ -4584,7 +4382,7 @@
                     <pic:cNvPicPr/>
                   </pic:nvPicPr>
                   <pic:blipFill>
-                    <a:blip r:embed="rId35"/>
+                    <a:blip r:embed="rId31"/>
                     <a:stretch>
                       <a:fillRect/>
                     </a:stretch>
@@ -4945,7 +4743,7 @@
         <w:drawing>
           <wp:inline xmlns:a="http://schemas.openxmlformats.org/drawingml/2006/main" xmlns:pic="http://schemas.openxmlformats.org/drawingml/2006/picture">
             <wp:extent cx="5669280" cy="2894696"/>
-            <wp:docPr id="27" name="Picture 27"/>
+            <wp:docPr id="23" name="Picture 23"/>
             <wp:cNvGraphicFramePr>
               <a:graphicFrameLocks noChangeAspect="1"/>
             </wp:cNvGraphicFramePr>
@@ -4957,7 +4755,7 @@
                     <pic:cNvPicPr/>
                   </pic:nvPicPr>
                   <pic:blipFill>
-                    <a:blip r:embed="rId36"/>
+                    <a:blip r:embed="rId32"/>
                     <a:stretch>
                       <a:fillRect/>
                     </a:stretch>
@@ -4993,7 +4791,7 @@
         <w:tab/>
       </w:r>
       <w:r>
-        <w:t>Wire 1 to the holder's 3V pair 3 + (square). Wire 2 to 3V pair 3 - (round).</w:t>
+        <w:t>Wire 1 into XIAO hole 3V3, alongside the sensor's 5V wire. Wire 2 into hole GND, alongside the sensor's GND wire. Solder.</w:t>
       </w:r>
     </w:p>
     <w:p>
@@ -5013,7 +4811,7 @@
         <w:tab/>
       </w:r>
       <w:r>
-        <w:t>Wire 3 to SuperMini hole 5. Wire 4 to SuperMini hole 3.</w:t>
+        <w:t>Wire 3 to XIAO hole D3. Wire 4 to XIAO hole D1.</w:t>
       </w:r>
     </w:p>
     <w:p>
@@ -5072,7 +4870,7 @@
         <w:drawing>
           <wp:inline xmlns:a="http://schemas.openxmlformats.org/drawingml/2006/main" xmlns:pic="http://schemas.openxmlformats.org/drawingml/2006/picture">
             <wp:extent cx="5669280" cy="3122908"/>
-            <wp:docPr id="28" name="Picture 28"/>
+            <wp:docPr id="24" name="Picture 24"/>
             <wp:cNvGraphicFramePr>
               <a:graphicFrameLocks noChangeAspect="1"/>
             </wp:cNvGraphicFramePr>
@@ -5084,7 +4882,7 @@
                     <pic:cNvPicPr/>
                   </pic:nvPicPr>
                   <pic:blipFill>
-                    <a:blip r:embed="rId37"/>
+                    <a:blip r:embed="rId33"/>
                     <a:stretch>
                       <a:fillRect/>
                     </a:stretch>
@@ -5173,7 +4971,7 @@
         <w:tab/>
       </w:r>
       <w:r>
-        <w:t>Screw the battery holder onto its 4 round pads with its USB-C socket facing into the box.</w:t>
+        <w:t>Set the battery holder on its platform (cell out) and screw it down through the hole in its floor with the M3 x 8 screw.</w:t>
       </w:r>
     </w:p>
     <w:p>
@@ -5213,7 +5011,7 @@
         <w:tab/>
       </w:r>
       <w:r>
-        <w:t>Slide the SuperMini's USB end under the two little lips, lay it flat, and screw the clamp tab over the other end with one M2.5 x 6 screw.</w:t>
+        <w:t>Lay the XIAO on its rests, USB-C toward the top of the box, between the two corner stops. Screw the clamp tab over the far end with one M2.5 x 6 screw: it presses on the metal can, clear of the antenna.</w:t>
       </w:r>
     </w:p>
     <w:p>
@@ -5224,7 +5022,7 @@
         <w:drawing>
           <wp:inline xmlns:a="http://schemas.openxmlformats.org/drawingml/2006/main" xmlns:pic="http://schemas.openxmlformats.org/drawingml/2006/picture">
             <wp:extent cx="3657600" cy="3344091"/>
-            <wp:docPr id="29" name="Picture 29"/>
+            <wp:docPr id="25" name="Picture 25"/>
             <wp:cNvGraphicFramePr>
               <a:graphicFrameLocks noChangeAspect="1"/>
             </wp:cNvGraphicFramePr>
@@ -5236,7 +5034,7 @@
                     <pic:cNvPicPr/>
                   </pic:nvPicPr>
                   <pic:blipFill>
-                    <a:blip r:embed="rId38"/>
+                    <a:blip r:embed="rId34"/>
                     <a:stretch>
                       <a:fillRect/>
                     </a:stretch>
@@ -5265,7 +5063,7 @@
           <w:color w:val="555555"/>
           <w:sz w:val="18"/>
         </w:rPr>
-        <w:t>SuperMini: USB end under the two lips, clamp tab over the far end</w:t>
+        <w:t>XIAO: USB end between the corner stops, clamp tab on the metal can</w:t>
       </w:r>
     </w:p>
     <w:p>
@@ -5285,7 +5083,7 @@
         <w:tab/>
       </w:r>
       <w:r>
-        <w:t>Plug the probe plugs into the sensor board. Tuck the wires so nothing is pinched.</w:t>
+        <w:t>Plug the short USB-C cable into the XIAO and push its free end between the two clip posts near the top.</w:t>
       </w:r>
     </w:p>
     <w:p>
@@ -5305,7 +5103,7 @@
         <w:tab/>
       </w:r>
       <w:r>
-        <w:t>Gently pull the cables back through the glands until they're snug, then tighten the gland caps by hand plus a quarter turn.</w:t>
+        <w:t>Plug the probe plugs into the sensor board. Tuck the wires so nothing is pinched.</w:t>
       </w:r>
     </w:p>
     <w:p>
@@ -5325,7 +5123,27 @@
         <w:tab/>
       </w:r>
       <w:r>
-        <w:t>Put the battery in, switch to stay on. Put the lid on with the 4 M3 screws and rubber washers; tighten evenly in a cross pattern.</w:t>
+        <w:t>Gently pull the cables back through the glands until they're snug, then tighten the gland caps by hand plus a quarter turn.</w:t>
+      </w:r>
+    </w:p>
+    <w:p>
+      <w:pPr>
+        <w:tabs>
+          <w:tab w:pos="648" w:val="left"/>
+        </w:tabs>
+        <w:spacing w:after="80"/>
+        <w:ind w:left="648" w:hanging="648"/>
+      </w:pPr>
+      <w:r>
+        <w:rPr>
+          <w:b/>
+          <w:color w:val="1F4E8C"/>
+        </w:rPr>
+        <w:t>7.</w:t>
+        <w:tab/>
+      </w:r>
+      <w:r>
+        <w:t>Put the battery in. Put the lid on with the 4 M3 screws and rubber washers; tighten evenly in a cross pattern.</w:t>
       </w:r>
     </w:p>
     <w:tbl>
@@ -5351,7 +5169,7 @@
               <w:t xml:space="preserve">Charging: </w:t>
             </w:r>
             <w:r>
-              <w:t>To charge later: take the lid off and plug a USB-C cable into the holder, or take the cell out and charge it in a charger.</w:t>
+              <w:t>To charge later: take the lid off and plug a charger into the free end of the USB-C cable. The XIAO charges slowly (a day or more from empty), so for a quick charge take the cell out and use an 18650 charger.</w:t>
             </w:r>
           </w:p>
         </w:tc>
@@ -5423,7 +5241,7 @@
         <w:tab/>
       </w:r>
       <w:r>
-        <w:t>Connect the SuperMini to the computer with a USB-C cable (battery out).</w:t>
+        <w:t>Connect the XIAO to the computer with a USB-C cable.</w:t>
       </w:r>
     </w:p>
     <w:p>
@@ -5443,7 +5261,7 @@
         <w:tab/>
       </w:r>
       <w:r>
-        <w:t>Run: esphome run firmware/dip.yaml   (or use the ESPHome Builder app in Home Assistant).</w:t>
+        <w:t>Run: esphome run firmware/dip.yaml   (or use the ESPHome Builder app in Home Assistant). It needs ESPHome 2025.7 or newer.</w:t>
       </w:r>
     </w:p>
     <w:p>
@@ -5463,7 +5281,7 @@
         <w:tab/>
       </w:r>
       <w:r>
-        <w:t>If the board isn't found, hold the BOOT button, tap RESET, then let go of BOOT, and try again.</w:t>
+        <w:t>If the board isn't found, hold the B (boot) button, tap R (reset), then let go of B, and try again.</w:t>
       </w:r>
     </w:p>
     <w:p>
@@ -5882,7 +5700,7 @@
               <w:rPr>
                 <w:sz w:val="20"/>
               </w:rPr>
-              <w:t>Battery flat, switch not on "stay on", or Wi-Fi out of range. Check the SuperMini's red power light with the lid off.</w:t>
+              <w:t>Battery flat or in backwards, or Wi-Fi out of range. Plug in the USB-C cable with the lid off and see if it shows up.</w:t>
             </w:r>
           </w:p>
         </w:tc>
@@ -5942,7 +5760,7 @@
               <w:rPr>
                 <w:sz w:val="20"/>
               </w:rPr>
-              <w:t>The temp wire (3) isn't reaching pin 5, or the 4.7k is missing or broken.</w:t>
+              <w:t>The temp wire (3) isn't reaching D3, or the 4.7k is missing or broken.</w:t>
             </w:r>
           </w:p>
         </w:tc>
@@ -6032,7 +5850,7 @@
               <w:rPr>
                 <w:sz w:val="20"/>
               </w:rPr>
-              <w:t>Resistor (A)'s wire not on the + battery contact, or (A)/(B) not soldered in hole 4.</w:t>
+              <w:t>Resistor (A) not on BAT +, or (A)/(B) not soldered in hole D0.</w:t>
             </w:r>
           </w:p>
         </w:tc>
@@ -6155,7 +5973,7 @@
               <w:rPr>
                 <w:sz w:val="20"/>
               </w:rPr>
-              <w:t>Holder 3V pair 1 +</w:t>
+              <w:t>Holder red</w:t>
             </w:r>
           </w:p>
         </w:tc>
@@ -6169,7 +5987,7 @@
               <w:rPr>
                 <w:sz w:val="20"/>
               </w:rPr>
-              <w:t>SuperMini 3.3</w:t>
+              <w:t>XIAO BAT +</w:t>
             </w:r>
           </w:p>
         </w:tc>
@@ -6183,7 +6001,7 @@
               <w:rPr>
                 <w:sz w:val="20"/>
               </w:rPr>
-              <w:t>red</w:t>
+              <w:t>underneath</w:t>
             </w:r>
           </w:p>
         </w:tc>
@@ -6199,7 +6017,7 @@
               <w:rPr>
                 <w:sz w:val="20"/>
               </w:rPr>
-              <w:t>Holder 3V pair 1 -</w:t>
+              <w:t>Holder black</w:t>
             </w:r>
           </w:p>
         </w:tc>
@@ -6213,7 +6031,7 @@
               <w:rPr>
                 <w:sz w:val="20"/>
               </w:rPr>
-              <w:t>SuperMini G</w:t>
+              <w:t>XIAO BAT -</w:t>
             </w:r>
           </w:p>
         </w:tc>
@@ -6227,7 +6045,7 @@
               <w:rPr>
                 <w:sz w:val="20"/>
               </w:rPr>
-              <w:t>black</w:t>
+              <w:t>underneath</w:t>
             </w:r>
           </w:p>
         </w:tc>
@@ -6243,7 +6061,7 @@
               <w:rPr>
                 <w:sz w:val="20"/>
               </w:rPr>
-              <w:t>Holder + battery contact</w:t>
+              <w:t>Resistor (A)</w:t>
             </w:r>
           </w:p>
         </w:tc>
@@ -6257,7 +6075,7 @@
               <w:rPr>
                 <w:sz w:val="20"/>
               </w:rPr>
-              <w:t>Resistor (A)</w:t>
+              <w:t>XIAO BAT + to D0</w:t>
             </w:r>
           </w:p>
         </w:tc>
@@ -6271,51 +6089,7 @@
               <w:rPr>
                 <w:sz w:val="20"/>
               </w:rPr>
-              <w:t>via the purple wire</w:t>
-            </w:r>
-          </w:p>
-        </w:tc>
-      </w:tr>
-      <w:tr>
-        <w:tc>
-          <w:tcPr>
-            <w:tcW w:type="dxa" w:w="3312"/>
-          </w:tcPr>
-          <w:p>
-            <w:r/>
-            <w:r>
-              <w:rPr>
-                <w:sz w:val="20"/>
-              </w:rPr>
-              <w:t>Resistor (A) other leg</w:t>
-            </w:r>
-          </w:p>
-        </w:tc>
-        <w:tc>
-          <w:tcPr>
-            <w:tcW w:type="dxa" w:w="3744"/>
-          </w:tcPr>
-          <w:p>
-            <w:r/>
-            <w:r>
-              <w:rPr>
-                <w:sz w:val="20"/>
-              </w:rPr>
-              <w:t>SuperMini 4</w:t>
-            </w:r>
-          </w:p>
-        </w:tc>
-        <w:tc>
-          <w:tcPr>
-            <w:tcW w:type="dxa" w:w="2448"/>
-          </w:tcPr>
-          <w:p>
-            <w:r/>
-            <w:r>
-              <w:rPr>
-                <w:sz w:val="20"/>
-              </w:rPr>
-              <w:t>shares hole 4 with (B)</w:t>
+              <w:t>on the underside</w:t>
             </w:r>
           </w:p>
         </w:tc>
@@ -6345,7 +6119,7 @@
               <w:rPr>
                 <w:sz w:val="20"/>
               </w:rPr>
-              <w:t>SuperMini 4 to SuperMini G</w:t>
+              <w:t>XIAO D0 to BAT -</w:t>
             </w:r>
           </w:p>
         </w:tc>
@@ -6359,7 +6133,7 @@
               <w:rPr>
                 <w:sz w:val="20"/>
               </w:rPr>
-              <w:t>legs sleeved, passes over 3.3</w:t>
+              <w:t>on the underside</w:t>
             </w:r>
           </w:p>
         </w:tc>
@@ -6375,7 +6149,7 @@
               <w:rPr>
                 <w:sz w:val="20"/>
               </w:rPr>
-              <w:t>Holder 3V pair 2 +</w:t>
+              <w:t>Sensor board 5V pin</w:t>
             </w:r>
           </w:p>
         </w:tc>
@@ -6389,7 +6163,7 @@
               <w:rPr>
                 <w:sz w:val="20"/>
               </w:rPr>
-              <w:t>Sensor board 5V pin</w:t>
+              <w:t>XIAO 3V3</w:t>
             </w:r>
           </w:p>
         </w:tc>
@@ -6403,7 +6177,7 @@
               <w:rPr>
                 <w:sz w:val="20"/>
               </w:rPr>
-              <w:t>female jumper</w:t>
+              <w:t>female jumper; shares the hole with cable wire 1</w:t>
             </w:r>
           </w:p>
         </w:tc>
@@ -6419,7 +6193,7 @@
               <w:rPr>
                 <w:sz w:val="20"/>
               </w:rPr>
-              <w:t>Holder 3V pair 2 -</w:t>
+              <w:t>Sensor board GND pin</w:t>
             </w:r>
           </w:p>
         </w:tc>
@@ -6433,7 +6207,7 @@
               <w:rPr>
                 <w:sz w:val="20"/>
               </w:rPr>
-              <w:t>Sensor board GND pin</w:t>
+              <w:t>XIAO GND</w:t>
             </w:r>
           </w:p>
         </w:tc>
@@ -6447,7 +6221,7 @@
               <w:rPr>
                 <w:sz w:val="20"/>
               </w:rPr>
-              <w:t>female jumper</w:t>
+              <w:t>female jumper; shares the hole with cable wire 2</w:t>
             </w:r>
           </w:p>
         </w:tc>
@@ -6477,7 +6251,7 @@
               <w:rPr>
                 <w:sz w:val="20"/>
               </w:rPr>
-              <w:t>SuperMini 6</w:t>
+              <w:t>XIAO D4</w:t>
             </w:r>
           </w:p>
         </w:tc>
@@ -6520,7 +6294,7 @@
               <w:rPr>
                 <w:sz w:val="20"/>
               </w:rPr>
-              <w:t>SuperMini 7</w:t>
+              <w:t>XIAO D5</w:t>
             </w:r>
           </w:p>
         </w:tc>
@@ -6607,7 +6381,7 @@
               <w:rPr>
                 <w:sz w:val="20"/>
               </w:rPr>
-              <w:t>Holder 3V pair 3 +</w:t>
+              <w:t>XIAO 3V3</w:t>
             </w:r>
           </w:p>
         </w:tc>
@@ -6651,7 +6425,7 @@
               <w:rPr>
                 <w:sz w:val="20"/>
               </w:rPr>
-              <w:t>Holder 3V pair 3 -</w:t>
+              <w:t>XIAO GND</w:t>
             </w:r>
           </w:p>
         </w:tc>
@@ -6694,7 +6468,7 @@
               <w:rPr>
                 <w:sz w:val="20"/>
               </w:rPr>
-              <w:t>SuperMini 5</w:t>
+              <w:t>XIAO D3</w:t>
             </w:r>
           </w:p>
         </w:tc>
@@ -6738,7 +6512,7 @@
               <w:rPr>
                 <w:sz w:val="20"/>
               </w:rPr>
-              <w:t>SuperMini 3</w:t>
+              <w:t>XIAO D1</w:t>
             </w:r>
           </w:p>
         </w:tc>

</xml_diff>

<commit_message>
Outside float bracket with 2-inch height slots
Co-Authored-By: Claude Opus 5.5 <noreply@anthropic.com>
</commit_message>
<xml_diff>
--- a/docs/DIP-assembly-guide.docx
+++ b/docs/DIP-assembly-guide.docx
@@ -2524,6 +2524,50 @@
           </w:p>
         </w:tc>
       </w:tr>
+      <w:tr>
+        <w:tc>
+          <w:tcPr>
+            <w:tcW w:type="dxa" w:w="2304"/>
+          </w:tcPr>
+          <w:p>
+            <w:r/>
+            <w:r>
+              <w:rPr>
+                <w:sz w:val="20"/>
+              </w:rPr>
+              <w:t>float_bracket_outside.stl</w:t>
+            </w:r>
+          </w:p>
+        </w:tc>
+        <w:tc>
+          <w:tcPr>
+            <w:tcW w:type="dxa" w:w="3744"/>
+          </w:tcPr>
+          <w:p>
+            <w:r/>
+            <w:r>
+              <w:rPr>
+                <w:sz w:val="20"/>
+              </w:rPr>
+              <w:t>Or: holds the float OUTSIDE the pipe, slots adjust its height by 2"</w:t>
+            </w:r>
+          </w:p>
+        </w:tc>
+        <w:tc>
+          <w:tcPr>
+            <w:tcW w:type="dxa" w:w="3456"/>
+          </w:tcPr>
+          <w:p>
+            <w:r/>
+            <w:r>
+              <w:rPr>
+                <w:sz w:val="20"/>
+              </w:rPr>
+              <w:t>As it comes (lying on its side)</w:t>
+            </w:r>
+          </w:p>
+        </w:tc>
+      </w:tr>
     </w:tbl>
     <w:p/>
     <w:p>

</xml_diff>